<commit_message>
Rename project to SunoBolo; regenerate all M1 documents
Co-Authored-By: Claude Opus 5 <noreply@anthropic.com>
</commit_message>
<xml_diff>
--- a/docs/M1-1-Requirements-Analysis.docx
+++ b/docs/M1-1-Requirements-Analysis.docx
@@ -10,7 +10,7 @@
         <w:rPr>
           <w:color w:val="0F766E"/>
         </w:rPr>
-        <w:t>BoloStock — Voice-Based Inventory Management for Small Businesses</w:t>
+        <w:t>SunoBolo — Voice-Based Inventory Management Using Conversational Speech</w:t>
       </w:r>
     </w:p>
     <w:p>
@@ -81,7 +81,7 @@
         <w:rPr>
           <w:b/>
         </w:rPr>
-        <w:t>BoloStock</w:t>
+        <w:t>SunoBolo</w:t>
       </w:r>
       <w:r>
         <w:t xml:space="preserve"> is a voice-first inventory system for small Indian retail shops.</w:t>
@@ -117,7 +117,7 @@
     </w:p>
     <w:p>
       <w:r>
-        <w:t>entry, performed with your mouth instead of your thumbs. BoloStock inverts this. The phone</w:t>
+        <w:t>entry, performed with your mouth instead of your thumbs. SunoBolo inverts this. The phone</w:t>
       </w:r>
     </w:p>
     <w:p>
@@ -157,7 +157,7 @@
         <w:rPr>
           <w:b/>
         </w:rPr>
-        <w:t>BoloStock captures it.</w:t>
+        <w:t>SunoBolo captures it.</w:t>
       </w:r>
     </w:p>
     <w:p>

</xml_diff>